<commit_message>
bo sung link git va link video bao cao vao file docx
</commit_message>
<xml_diff>
--- a/DOCX/Báo cáo dự án nhóm 7.docx
+++ b/DOCX/Báo cáo dự án nhóm 7.docx
@@ -1,6 +1,6 @@
 
 <file path=word/document.xml><?xml version="1.0" encoding="utf-8"?>
-<w:document xmlns:wpc="http://schemas.microsoft.com/office/word/2010/wordprocessingCanvas" xmlns:cx="http://schemas.microsoft.com/office/drawing/2014/chartex" xmlns:cx1="http://schemas.microsoft.com/office/drawing/2015/9/8/chartex" xmlns:cx2="http://schemas.microsoft.com/office/drawing/2015/10/21/chartex" xmlns:cx3="http://schemas.microsoft.com/office/drawing/2016/5/9/chartex" xmlns:cx4="http://schemas.microsoft.com/office/drawing/2016/5/10/chartex" xmlns:cx5="http://schemas.microsoft.com/office/drawing/2016/5/11/chartex" xmlns:cx6="http://schemas.microsoft.com/office/drawing/2016/5/12/chartex" xmlns:cx7="http://schemas.microsoft.com/office/drawing/2016/5/13/chartex" xmlns:cx8="http://schemas.microsoft.com/office/drawing/2016/5/14/chartex" xmlns:mc="http://schemas.openxmlformats.org/markup-compatibility/2006" xmlns:aink="http://schemas.microsoft.com/office/drawing/2016/ink" xmlns:am3d="http://schemas.microsoft.com/office/drawing/2017/model3d" xmlns:o="urn:schemas-microsoft-com:office:office" xmlns:r="http://schemas.openxmlformats.org/officeDocument/2006/relationships" xmlns:m="http://schemas.openxmlformats.org/officeDocument/2006/math" xmlns:v="urn:schemas-microsoft-com:vml" xmlns:wp14="http://schemas.microsoft.com/office/word/2010/wordprocessingDrawing" xmlns:wp="http://schemas.openxmlformats.org/drawingml/2006/wordprocessingDrawing" xmlns:w10="urn:schemas-microsoft-com:office:word" xmlns:w="http://schemas.openxmlformats.org/wordprocessingml/2006/main" xmlns:w14="http://schemas.microsoft.com/office/word/2010/wordml" xmlns:w15="http://schemas.microsoft.com/office/word/2012/wordml" xmlns:w16cex="http://schemas.microsoft.com/office/word/2018/wordml/cex" xmlns:w16cid="http://schemas.microsoft.com/office/word/2016/wordml/cid" xmlns:w16="http://schemas.microsoft.com/office/word/2018/wordml" xmlns:w16sdtdh="http://schemas.microsoft.com/office/word/2020/wordml/sdtdatahash" xmlns:w16se="http://schemas.microsoft.com/office/word/2015/wordml/symex" xmlns:wpg="http://schemas.microsoft.com/office/word/2010/wordprocessingGroup" xmlns:wpi="http://schemas.microsoft.com/office/word/2010/wordprocessingInk" xmlns:wne="http://schemas.microsoft.com/office/word/2006/wordml" xmlns:wps="http://schemas.microsoft.com/office/word/2010/wordprocessingShape" mc:Ignorable="w14 w15 w16se w16cid w16 w16cex w16sdtdh wp14">
+<w:document xmlns:wpc="http://schemas.microsoft.com/office/word/2010/wordprocessingCanvas" xmlns:cx="http://schemas.microsoft.com/office/drawing/2014/chartex" xmlns:cx1="http://schemas.microsoft.com/office/drawing/2015/9/8/chartex" xmlns:cx2="http://schemas.microsoft.com/office/drawing/2015/10/21/chartex" xmlns:cx3="http://schemas.microsoft.com/office/drawing/2016/5/9/chartex" xmlns:cx4="http://schemas.microsoft.com/office/drawing/2016/5/10/chartex" xmlns:cx5="http://schemas.microsoft.com/office/drawing/2016/5/11/chartex" xmlns:cx6="http://schemas.microsoft.com/office/drawing/2016/5/12/chartex" xmlns:cx7="http://schemas.microsoft.com/office/drawing/2016/5/13/chartex" xmlns:cx8="http://schemas.microsoft.com/office/drawing/2016/5/14/chartex" xmlns:mc="http://schemas.openxmlformats.org/markup-compatibility/2006" xmlns:aink="http://schemas.microsoft.com/office/drawing/2016/ink" xmlns:am3d="http://schemas.microsoft.com/office/drawing/2017/model3d" xmlns:o="urn:schemas-microsoft-com:office:office" xmlns:oel="http://schemas.microsoft.com/office/2019/extlst" xmlns:r="http://schemas.openxmlformats.org/officeDocument/2006/relationships" xmlns:m="http://schemas.openxmlformats.org/officeDocument/2006/math" xmlns:v="urn:schemas-microsoft-com:vml" xmlns:wp14="http://schemas.microsoft.com/office/word/2010/wordprocessingDrawing" xmlns:wp="http://schemas.openxmlformats.org/drawingml/2006/wordprocessingDrawing" xmlns:w10="urn:schemas-microsoft-com:office:word" xmlns:w="http://schemas.openxmlformats.org/wordprocessingml/2006/main" xmlns:w14="http://schemas.microsoft.com/office/word/2010/wordml" xmlns:w15="http://schemas.microsoft.com/office/word/2012/wordml" xmlns:w16cex="http://schemas.microsoft.com/office/word/2018/wordml/cex" xmlns:w16cid="http://schemas.microsoft.com/office/word/2016/wordml/cid" xmlns:w16="http://schemas.microsoft.com/office/word/2018/wordml" xmlns:w16du="http://schemas.microsoft.com/office/word/2023/wordml/word16du" xmlns:w16sdtdh="http://schemas.microsoft.com/office/word/2020/wordml/sdtdatahash" xmlns:w16sdtfl="http://schemas.microsoft.com/office/word/2024/wordml/sdtformatlock" xmlns:w16se="http://schemas.microsoft.com/office/word/2015/wordml/symex" xmlns:wpg="http://schemas.microsoft.com/office/word/2010/wordprocessingGroup" xmlns:wpi="http://schemas.microsoft.com/office/word/2010/wordprocessingInk" xmlns:wne="http://schemas.microsoft.com/office/word/2006/wordml" xmlns:wps="http://schemas.microsoft.com/office/word/2010/wordprocessingShape" mc:Ignorable="w14 w15 w16se w16cid w16 w16cex w16sdtdh w16sdtfl w16du wp14">
   <w:body>
     <w:p>
       <w:pPr>
@@ -278,32 +278,34 @@
         <w:rPr>
           <w:sz w:val="26"/>
           <w:szCs w:val="26"/>
-          <w:lang w:val="en-US"/>
-        </w:rPr>
-      </w:pPr>
-      <w:r>
-        <w:rPr>
-          <w:sz w:val="26"/>
-          <w:szCs w:val="26"/>
-          <w:lang w:val="en-US"/>
+          <w:lang w:val="fr-FR"/>
+        </w:rPr>
+      </w:pPr>
+      <w:r>
+        <w:rPr>
+          <w:sz w:val="26"/>
+          <w:szCs w:val="26"/>
+          <w:lang w:val="fr-FR"/>
         </w:rPr>
         <w:tab/>
       </w:r>
+      <w:proofErr w:type="gramStart"/>
       <w:r>
         <w:rPr>
           <w:b/>
           <w:bCs/>
           <w:sz w:val="26"/>
           <w:szCs w:val="26"/>
-          <w:lang w:val="en-US"/>
+          <w:lang w:val="fr-FR"/>
         </w:rPr>
         <w:t>GVHD:</w:t>
       </w:r>
-      <w:r>
-        <w:rPr>
-          <w:sz w:val="26"/>
-          <w:szCs w:val="26"/>
-          <w:lang w:val="en-US"/>
+      <w:proofErr w:type="gramEnd"/>
+      <w:r>
+        <w:rPr>
+          <w:sz w:val="26"/>
+          <w:szCs w:val="26"/>
+          <w:lang w:val="fr-FR"/>
         </w:rPr>
         <w:t xml:space="preserve"> Mai Ngọc Châu</w:t>
       </w:r>
@@ -319,27 +321,129 @@
           <w:bCs/>
           <w:sz w:val="26"/>
           <w:szCs w:val="26"/>
-          <w:lang w:val="en-US"/>
-        </w:rPr>
-      </w:pPr>
-      <w:r>
-        <w:rPr>
-          <w:sz w:val="26"/>
-          <w:szCs w:val="26"/>
-          <w:lang w:val="en-US"/>
+          <w:lang w:val="fr-FR"/>
+        </w:rPr>
+      </w:pPr>
+      <w:r>
+        <w:rPr>
+          <w:sz w:val="26"/>
+          <w:szCs w:val="26"/>
+          <w:lang w:val="fr-FR"/>
         </w:rPr>
         <w:tab/>
       </w:r>
+      <w:proofErr w:type="spellStart"/>
       <w:r>
         <w:rPr>
           <w:b/>
           <w:bCs/>
           <w:sz w:val="26"/>
           <w:szCs w:val="26"/>
-          <w:lang w:val="en-US"/>
-        </w:rPr>
-        <w:t>Nhóm sinh viên thực hiện:</w:t>
-      </w:r>
+          <w:lang w:val="fr-FR"/>
+        </w:rPr>
+        <w:t>Nhóm</w:t>
+      </w:r>
+      <w:proofErr w:type="spellEnd"/>
+      <w:r>
+        <w:rPr>
+          <w:b/>
+          <w:bCs/>
+          <w:sz w:val="26"/>
+          <w:szCs w:val="26"/>
+          <w:lang w:val="fr-FR"/>
+        </w:rPr>
+        <w:t xml:space="preserve"> </w:t>
+      </w:r>
+      <w:proofErr w:type="spellStart"/>
+      <w:r>
+        <w:rPr>
+          <w:b/>
+          <w:bCs/>
+          <w:sz w:val="26"/>
+          <w:szCs w:val="26"/>
+          <w:lang w:val="fr-FR"/>
+        </w:rPr>
+        <w:t>sinh</w:t>
+      </w:r>
+      <w:proofErr w:type="spellEnd"/>
+      <w:r>
+        <w:rPr>
+          <w:b/>
+          <w:bCs/>
+          <w:sz w:val="26"/>
+          <w:szCs w:val="26"/>
+          <w:lang w:val="fr-FR"/>
+        </w:rPr>
+        <w:t xml:space="preserve"> </w:t>
+      </w:r>
+      <w:proofErr w:type="spellStart"/>
+      <w:r>
+        <w:rPr>
+          <w:b/>
+          <w:bCs/>
+          <w:sz w:val="26"/>
+          <w:szCs w:val="26"/>
+          <w:lang w:val="fr-FR"/>
+        </w:rPr>
+        <w:t>viên</w:t>
+      </w:r>
+      <w:proofErr w:type="spellEnd"/>
+      <w:r>
+        <w:rPr>
+          <w:b/>
+          <w:bCs/>
+          <w:sz w:val="26"/>
+          <w:szCs w:val="26"/>
+          <w:lang w:val="fr-FR"/>
+        </w:rPr>
+        <w:t xml:space="preserve"> </w:t>
+      </w:r>
+      <w:proofErr w:type="spellStart"/>
+      <w:r>
+        <w:rPr>
+          <w:b/>
+          <w:bCs/>
+          <w:sz w:val="26"/>
+          <w:szCs w:val="26"/>
+          <w:lang w:val="fr-FR"/>
+        </w:rPr>
+        <w:t>thực</w:t>
+      </w:r>
+      <w:proofErr w:type="spellEnd"/>
+      <w:r>
+        <w:rPr>
+          <w:b/>
+          <w:bCs/>
+          <w:sz w:val="26"/>
+          <w:szCs w:val="26"/>
+          <w:lang w:val="fr-FR"/>
+        </w:rPr>
+        <w:t xml:space="preserve"> </w:t>
+      </w:r>
+      <w:proofErr w:type="spellStart"/>
+      <w:proofErr w:type="gramStart"/>
+      <w:r>
+        <w:rPr>
+          <w:b/>
+          <w:bCs/>
+          <w:sz w:val="26"/>
+          <w:szCs w:val="26"/>
+          <w:lang w:val="fr-FR"/>
+        </w:rPr>
+        <w:t>hiện</w:t>
+      </w:r>
+      <w:proofErr w:type="spellEnd"/>
+      <w:r>
+        <w:rPr>
+          <w:b/>
+          <w:bCs/>
+          <w:sz w:val="26"/>
+          <w:szCs w:val="26"/>
+          <w:lang w:val="fr-FR"/>
+        </w:rPr>
+        <w:t>:</w:t>
+      </w:r>
+      <w:proofErr w:type="gramEnd"/>
     </w:p>
     <w:p>
       <w:pPr>
@@ -350,7 +454,7 @@
         <w:rPr>
           <w:sz w:val="26"/>
           <w:szCs w:val="26"/>
-          <w:lang w:val="en-US"/>
+          <w:lang w:val="fr-FR"/>
         </w:rPr>
       </w:pPr>
       <w:r>
@@ -359,7 +463,7 @@
           <w:bCs/>
           <w:sz w:val="26"/>
           <w:szCs w:val="26"/>
-          <w:lang w:val="en-US"/>
+          <w:lang w:val="fr-FR"/>
         </w:rPr>
         <w:tab/>
       </w:r>
@@ -367,25 +471,27 @@
         <w:rPr>
           <w:sz w:val="26"/>
           <w:szCs w:val="26"/>
-          <w:lang w:val="en-US"/>
-        </w:rPr>
-        <w:t xml:space="preserve">Nguyễn Văn Dư </w:t>
-      </w:r>
-      <w:r>
-        <w:rPr>
-          <w:sz w:val="26"/>
-          <w:szCs w:val="26"/>
-          <w:lang w:val="en-US"/>
-        </w:rPr>
-        <w:t xml:space="preserve">– </w:t>
-      </w:r>
-      <w:r>
-        <w:rPr>
-          <w:sz w:val="26"/>
-          <w:szCs w:val="26"/>
-          <w:lang w:val="en-US"/>
-        </w:rPr>
-        <w:t>062205001206</w:t>
+          <w:lang w:val="fr-FR"/>
+        </w:rPr>
+        <w:t xml:space="preserve">Nguyễn Văn </w:t>
+      </w:r>
+      <w:proofErr w:type="spellStart"/>
+      <w:r>
+        <w:rPr>
+          <w:sz w:val="26"/>
+          <w:szCs w:val="26"/>
+          <w:lang w:val="fr-FR"/>
+        </w:rPr>
+        <w:t>Dư</w:t>
+      </w:r>
+      <w:proofErr w:type="spellEnd"/>
+      <w:r>
+        <w:rPr>
+          <w:sz w:val="26"/>
+          <w:szCs w:val="26"/>
+          <w:lang w:val="fr-FR"/>
+        </w:rPr>
+        <w:t xml:space="preserve"> – 062205001206</w:t>
       </w:r>
     </w:p>
     <w:p>
@@ -397,40 +503,34 @@
         <w:rPr>
           <w:sz w:val="26"/>
           <w:szCs w:val="26"/>
-          <w:lang w:val="en-US"/>
-        </w:rPr>
-      </w:pPr>
-      <w:r>
-        <w:rPr>
-          <w:sz w:val="26"/>
-          <w:szCs w:val="26"/>
-          <w:lang w:val="en-US"/>
+          <w:lang w:val="fr-FR"/>
+        </w:rPr>
+      </w:pPr>
+      <w:r>
+        <w:rPr>
+          <w:sz w:val="26"/>
+          <w:szCs w:val="26"/>
+          <w:lang w:val="fr-FR"/>
         </w:rPr>
         <w:tab/>
       </w:r>
-      <w:r>
-        <w:rPr>
-          <w:sz w:val="26"/>
-          <w:szCs w:val="26"/>
-          <w:lang w:val="en-US"/>
-        </w:rPr>
-        <w:t>Trần Thanh Hồng</w:t>
-      </w:r>
-      <w:r>
-        <w:rPr>
-          <w:sz w:val="26"/>
-          <w:szCs w:val="26"/>
-          <w:lang w:val="en-US"/>
-        </w:rPr>
-        <w:t xml:space="preserve"> – </w:t>
-      </w:r>
-      <w:r>
-        <w:rPr>
-          <w:sz w:val="26"/>
-          <w:szCs w:val="26"/>
-          <w:lang w:val="en-US"/>
-        </w:rPr>
-        <w:t>082206016304</w:t>
+      <w:proofErr w:type="spellStart"/>
+      <w:r>
+        <w:rPr>
+          <w:sz w:val="26"/>
+          <w:szCs w:val="26"/>
+          <w:lang w:val="fr-FR"/>
+        </w:rPr>
+        <w:t>Trần</w:t>
+      </w:r>
+      <w:proofErr w:type="spellEnd"/>
+      <w:r>
+        <w:rPr>
+          <w:sz w:val="26"/>
+          <w:szCs w:val="26"/>
+          <w:lang w:val="fr-FR"/>
+        </w:rPr>
+        <w:t xml:space="preserve"> Thanh Hồng – 082206016304</w:t>
       </w:r>
     </w:p>
     <w:p>
@@ -442,38 +542,40 @@
         <w:rPr>
           <w:sz w:val="26"/>
           <w:szCs w:val="26"/>
-          <w:lang w:val="en-US"/>
-        </w:rPr>
-      </w:pPr>
-      <w:r>
-        <w:rPr>
-          <w:sz w:val="26"/>
-          <w:szCs w:val="26"/>
-          <w:lang w:val="en-US"/>
+          <w:lang w:val="fr-FR"/>
+        </w:rPr>
+      </w:pPr>
+      <w:r>
+        <w:rPr>
+          <w:sz w:val="26"/>
+          <w:szCs w:val="26"/>
+          <w:lang w:val="fr-FR"/>
         </w:rPr>
         <w:tab/>
       </w:r>
-      <w:r>
-        <w:rPr>
-          <w:sz w:val="26"/>
-          <w:szCs w:val="26"/>
-          <w:lang w:val="en-US"/>
-        </w:rPr>
-        <w:t>Võ Kim Duyên</w:t>
-      </w:r>
-      <w:r>
-        <w:rPr>
-          <w:sz w:val="26"/>
-          <w:szCs w:val="26"/>
-          <w:lang w:val="en-US"/>
-        </w:rPr>
-        <w:t xml:space="preserve"> </w:t>
-      </w:r>
-      <w:r>
-        <w:rPr>
-          <w:sz w:val="26"/>
-          <w:szCs w:val="26"/>
-          <w:lang w:val="en-US"/>
+      <w:proofErr w:type="spellStart"/>
+      <w:r>
+        <w:rPr>
+          <w:sz w:val="26"/>
+          <w:szCs w:val="26"/>
+          <w:lang w:val="fr-FR"/>
+        </w:rPr>
+        <w:t>Võ</w:t>
+      </w:r>
+      <w:proofErr w:type="spellEnd"/>
+      <w:r>
+        <w:rPr>
+          <w:sz w:val="26"/>
+          <w:szCs w:val="26"/>
+          <w:lang w:val="fr-FR"/>
+        </w:rPr>
+        <w:t xml:space="preserve"> Kim Duyên </w:t>
+      </w:r>
+      <w:r>
+        <w:rPr>
+          <w:sz w:val="26"/>
+          <w:szCs w:val="26"/>
+          <w:lang w:val="fr-FR"/>
         </w:rPr>
         <w:t>–</w:t>
       </w:r>
@@ -481,17 +583,9 @@
         <w:rPr>
           <w:sz w:val="26"/>
           <w:szCs w:val="26"/>
-          <w:lang w:val="en-US"/>
-        </w:rPr>
-        <w:t xml:space="preserve"> </w:t>
-      </w:r>
-      <w:r>
-        <w:rPr>
-          <w:sz w:val="26"/>
-          <w:szCs w:val="26"/>
-          <w:lang w:val="en-US"/>
-        </w:rPr>
-        <w:t>096306009477</w:t>
+          <w:lang w:val="fr-FR"/>
+        </w:rPr>
+        <w:t xml:space="preserve"> 096306009477</w:t>
       </w:r>
     </w:p>
     <w:p>
@@ -503,14 +597,14 @@
         <w:rPr>
           <w:sz w:val="26"/>
           <w:szCs w:val="26"/>
-          <w:lang w:val="en-US"/>
-        </w:rPr>
-      </w:pPr>
-      <w:r>
-        <w:rPr>
-          <w:sz w:val="26"/>
-          <w:szCs w:val="26"/>
-          <w:lang w:val="en-US"/>
+          <w:lang w:val="fr-FR"/>
+        </w:rPr>
+      </w:pPr>
+      <w:r>
+        <w:rPr>
+          <w:sz w:val="26"/>
+          <w:szCs w:val="26"/>
+          <w:lang w:val="fr-FR"/>
         </w:rPr>
         <w:tab/>
         <w:t xml:space="preserve">Nguyễn Ngọc Phương </w:t>
@@ -519,7 +613,7 @@
         <w:rPr>
           <w:sz w:val="26"/>
           <w:szCs w:val="26"/>
-          <w:lang w:val="en-US"/>
+          <w:lang w:val="fr-FR"/>
         </w:rPr>
         <w:t>–</w:t>
       </w:r>
@@ -527,7 +621,7 @@
         <w:rPr>
           <w:sz w:val="26"/>
           <w:szCs w:val="26"/>
-          <w:lang w:val="en-US"/>
+          <w:lang w:val="fr-FR"/>
         </w:rPr>
         <w:t xml:space="preserve"> 075306018872</w:t>
       </w:r>
@@ -541,38 +635,23 @@
         <w:rPr>
           <w:sz w:val="26"/>
           <w:szCs w:val="26"/>
-          <w:lang w:val="en-US"/>
-        </w:rPr>
-      </w:pPr>
-      <w:r>
-        <w:rPr>
-          <w:sz w:val="26"/>
-          <w:szCs w:val="26"/>
-          <w:lang w:val="en-US"/>
+          <w:lang w:val="fr-FR"/>
+        </w:rPr>
+      </w:pPr>
+      <w:r>
+        <w:rPr>
+          <w:sz w:val="26"/>
+          <w:szCs w:val="26"/>
+          <w:lang w:val="fr-FR"/>
         </w:rPr>
         <w:tab/>
-      </w:r>
-      <w:r>
-        <w:rPr>
-          <w:sz w:val="26"/>
-          <w:szCs w:val="26"/>
-          <w:lang w:val="en-US"/>
-        </w:rPr>
-        <w:t>Nguyễn Văn Khương</w:t>
-      </w:r>
-      <w:r>
-        <w:rPr>
-          <w:sz w:val="26"/>
-          <w:szCs w:val="26"/>
-          <w:lang w:val="en-US"/>
-        </w:rPr>
-        <w:t xml:space="preserve"> </w:t>
-      </w:r>
-      <w:r>
-        <w:rPr>
-          <w:sz w:val="26"/>
-          <w:szCs w:val="26"/>
-          <w:lang w:val="en-US"/>
+        <w:t xml:space="preserve">Nguyễn Văn Khương </w:t>
+      </w:r>
+      <w:r>
+        <w:rPr>
+          <w:sz w:val="26"/>
+          <w:szCs w:val="26"/>
+          <w:lang w:val="fr-FR"/>
         </w:rPr>
         <w:t>–</w:t>
       </w:r>
@@ -580,17 +659,9 @@
         <w:rPr>
           <w:sz w:val="26"/>
           <w:szCs w:val="26"/>
-          <w:lang w:val="en-US"/>
-        </w:rPr>
-        <w:t xml:space="preserve"> </w:t>
-      </w:r>
-      <w:r>
-        <w:rPr>
-          <w:sz w:val="26"/>
-          <w:szCs w:val="26"/>
-          <w:lang w:val="en-US"/>
-        </w:rPr>
-        <w:t>067206000817</w:t>
+          <w:lang w:val="fr-FR"/>
+        </w:rPr>
+        <w:t xml:space="preserve"> 067206000817</w:t>
       </w:r>
     </w:p>
     <w:p>
@@ -602,14 +673,14 @@
         <w:rPr>
           <w:sz w:val="26"/>
           <w:szCs w:val="26"/>
-          <w:lang w:val="en-US"/>
-        </w:rPr>
-      </w:pPr>
-      <w:r>
-        <w:rPr>
-          <w:sz w:val="26"/>
-          <w:szCs w:val="26"/>
-          <w:lang w:val="en-US"/>
+          <w:lang w:val="fr-FR"/>
+        </w:rPr>
+      </w:pPr>
+      <w:r>
+        <w:rPr>
+          <w:sz w:val="26"/>
+          <w:szCs w:val="26"/>
+          <w:lang w:val="fr-FR"/>
         </w:rPr>
         <w:tab/>
         <w:t xml:space="preserve">Đặng Thành Đạt </w:t>
@@ -618,7 +689,7 @@
         <w:rPr>
           <w:sz w:val="26"/>
           <w:szCs w:val="26"/>
-          <w:lang w:val="en-US"/>
+          <w:lang w:val="fr-FR"/>
         </w:rPr>
         <w:t>–</w:t>
       </w:r>
@@ -626,7 +697,7 @@
         <w:rPr>
           <w:sz w:val="26"/>
           <w:szCs w:val="26"/>
-          <w:lang w:val="en-US"/>
+          <w:lang w:val="fr-FR"/>
         </w:rPr>
         <w:t xml:space="preserve"> </w:t>
       </w:r>
@@ -634,7 +705,7 @@
         <w:rPr>
           <w:sz w:val="26"/>
           <w:szCs w:val="26"/>
-          <w:lang w:val="en-US"/>
+          <w:lang w:val="fr-FR"/>
         </w:rPr>
         <w:t>086206005153</w:t>
       </w:r>
@@ -648,7 +719,7 @@
         <w:rPr>
           <w:sz w:val="26"/>
           <w:szCs w:val="26"/>
-          <w:lang w:val="en-US"/>
+          <w:lang w:val="fr-FR"/>
         </w:rPr>
       </w:pPr>
     </w:p>
@@ -659,12 +730,12 @@
         </w:tabs>
         <w:spacing w:before="120" w:after="120" w:line="276" w:lineRule="auto"/>
         <w:rPr>
-          <w:lang w:val="en-US"/>
-        </w:rPr>
-      </w:pPr>
-      <w:r>
-        <w:rPr>
-          <w:lang w:val="en-US"/>
+          <w:lang w:val="fr-FR"/>
+        </w:rPr>
+      </w:pPr>
+      <w:r>
+        <w:rPr>
+          <w:lang w:val="fr-FR"/>
         </w:rPr>
         <w:tab/>
       </w:r>
@@ -676,7 +747,7 @@
         </w:tabs>
         <w:spacing w:before="120" w:after="120" w:line="276" w:lineRule="auto"/>
         <w:rPr>
-          <w:lang w:val="en-US"/>
+          <w:lang w:val="fr-FR"/>
         </w:rPr>
       </w:pPr>
     </w:p>
@@ -687,7 +758,7 @@
         </w:tabs>
         <w:spacing w:before="120" w:after="120" w:line="276" w:lineRule="auto"/>
         <w:rPr>
-          <w:lang w:val="en-US"/>
+          <w:lang w:val="fr-FR"/>
         </w:rPr>
       </w:pPr>
     </w:p>
@@ -698,7 +769,7 @@
         </w:tabs>
         <w:spacing w:before="120" w:after="120" w:line="276" w:lineRule="auto"/>
         <w:rPr>
-          <w:lang w:val="en-US"/>
+          <w:lang w:val="fr-FR"/>
         </w:rPr>
       </w:pPr>
     </w:p>
@@ -714,7 +785,7 @@
           <w:iCs/>
           <w:sz w:val="26"/>
           <w:szCs w:val="26"/>
-          <w:lang w:val="en-US"/>
+          <w:lang w:val="fr-FR"/>
         </w:rPr>
       </w:pPr>
       <w:r>
@@ -723,16 +794,104 @@
           <w:iCs/>
           <w:sz w:val="26"/>
           <w:szCs w:val="26"/>
-          <w:lang w:val="en-US"/>
-        </w:rPr>
-        <w:t>Thành phố Hồ Chí Minh, tháng 4 năm 2026</w:t>
+          <w:lang w:val="fr-FR"/>
+        </w:rPr>
+        <w:t xml:space="preserve">Thành </w:t>
+      </w:r>
+      <w:proofErr w:type="spellStart"/>
+      <w:r>
+        <w:rPr>
+          <w:i/>
+          <w:iCs/>
+          <w:sz w:val="26"/>
+          <w:szCs w:val="26"/>
+          <w:lang w:val="fr-FR"/>
+        </w:rPr>
+        <w:t>phố</w:t>
+      </w:r>
+      <w:proofErr w:type="spellEnd"/>
+      <w:r>
+        <w:rPr>
+          <w:i/>
+          <w:iCs/>
+          <w:sz w:val="26"/>
+          <w:szCs w:val="26"/>
+          <w:lang w:val="fr-FR"/>
+        </w:rPr>
+        <w:t xml:space="preserve"> </w:t>
+      </w:r>
+      <w:proofErr w:type="spellStart"/>
+      <w:r>
+        <w:rPr>
+          <w:i/>
+          <w:iCs/>
+          <w:sz w:val="26"/>
+          <w:szCs w:val="26"/>
+          <w:lang w:val="fr-FR"/>
+        </w:rPr>
+        <w:t>Hồ</w:t>
+      </w:r>
+      <w:proofErr w:type="spellEnd"/>
+      <w:r>
+        <w:rPr>
+          <w:i/>
+          <w:iCs/>
+          <w:sz w:val="26"/>
+          <w:szCs w:val="26"/>
+          <w:lang w:val="fr-FR"/>
+        </w:rPr>
+        <w:t xml:space="preserve"> Chí Minh, </w:t>
+      </w:r>
+      <w:proofErr w:type="spellStart"/>
+      <w:r>
+        <w:rPr>
+          <w:i/>
+          <w:iCs/>
+          <w:sz w:val="26"/>
+          <w:szCs w:val="26"/>
+          <w:lang w:val="fr-FR"/>
+        </w:rPr>
+        <w:t>tháng</w:t>
+      </w:r>
+      <w:proofErr w:type="spellEnd"/>
+      <w:r>
+        <w:rPr>
+          <w:i/>
+          <w:iCs/>
+          <w:sz w:val="26"/>
+          <w:szCs w:val="26"/>
+          <w:lang w:val="fr-FR"/>
+        </w:rPr>
+        <w:t xml:space="preserve"> 4 </w:t>
+      </w:r>
+      <w:proofErr w:type="spellStart"/>
+      <w:r>
+        <w:rPr>
+          <w:i/>
+          <w:iCs/>
+          <w:sz w:val="26"/>
+          <w:szCs w:val="26"/>
+          <w:lang w:val="fr-FR"/>
+        </w:rPr>
+        <w:t>năm</w:t>
+      </w:r>
+      <w:proofErr w:type="spellEnd"/>
+      <w:r>
+        <w:rPr>
+          <w:i/>
+          <w:iCs/>
+          <w:sz w:val="26"/>
+          <w:szCs w:val="26"/>
+          <w:lang w:val="fr-FR"/>
+        </w:rPr>
+        <w:t xml:space="preserve"> 2026</w:t>
       </w:r>
     </w:p>
     <w:p>
       <w:pPr>
         <w:spacing w:before="120" w:after="120" w:line="276" w:lineRule="auto"/>
         <w:rPr>
-          <w:lang w:val="en-US"/>
+          <w:lang w:val="fr-FR"/>
         </w:rPr>
         <w:sectPr>
           <w:pgSz w:w="11906" w:h="16838"/>
@@ -3639,7 +3798,6 @@
         <w:tc>
           <w:tcPr>
             <w:tcW w:w="2000" w:type="dxa"/>
-            <w:shd w:val="clear" w:color="auto" w:fill="auto"/>
             <w:tcMar>
               <w:top w:w="60" w:type="dxa"/>
               <w:left w:w="100" w:type="dxa"/>
@@ -3671,7 +3829,6 @@
         <w:tc>
           <w:tcPr>
             <w:tcW w:w="1800" w:type="dxa"/>
-            <w:shd w:val="clear" w:color="auto" w:fill="auto"/>
             <w:tcMar>
               <w:top w:w="60" w:type="dxa"/>
               <w:left w:w="100" w:type="dxa"/>
@@ -3703,7 +3860,6 @@
         <w:tc>
           <w:tcPr>
             <w:tcW w:w="5838" w:type="dxa"/>
-            <w:shd w:val="clear" w:color="auto" w:fill="auto"/>
             <w:tcMar>
               <w:top w:w="60" w:type="dxa"/>
               <w:left w:w="100" w:type="dxa"/>
@@ -3823,7 +3979,6 @@
         <w:tc>
           <w:tcPr>
             <w:tcW w:w="2000" w:type="dxa"/>
-            <w:shd w:val="clear" w:color="auto" w:fill="auto"/>
             <w:tcMar>
               <w:top w:w="50" w:type="dxa"/>
               <w:left w:w="100" w:type="dxa"/>
@@ -3851,7 +4006,6 @@
         <w:tc>
           <w:tcPr>
             <w:tcW w:w="1800" w:type="dxa"/>
-            <w:shd w:val="clear" w:color="auto" w:fill="auto"/>
             <w:tcMar>
               <w:top w:w="50" w:type="dxa"/>
               <w:left w:w="100" w:type="dxa"/>
@@ -3879,7 +4033,6 @@
         <w:tc>
           <w:tcPr>
             <w:tcW w:w="5838" w:type="dxa"/>
-            <w:shd w:val="clear" w:color="auto" w:fill="auto"/>
             <w:tcMar>
               <w:top w:w="50" w:type="dxa"/>
               <w:left w:w="100" w:type="dxa"/>
@@ -3909,7 +4062,6 @@
         <w:tc>
           <w:tcPr>
             <w:tcW w:w="2000" w:type="dxa"/>
-            <w:shd w:val="clear" w:color="auto" w:fill="auto"/>
             <w:tcMar>
               <w:top w:w="50" w:type="dxa"/>
               <w:left w:w="100" w:type="dxa"/>
@@ -3937,7 +4089,6 @@
         <w:tc>
           <w:tcPr>
             <w:tcW w:w="1800" w:type="dxa"/>
-            <w:shd w:val="clear" w:color="auto" w:fill="auto"/>
             <w:tcMar>
               <w:top w:w="50" w:type="dxa"/>
               <w:left w:w="100" w:type="dxa"/>
@@ -3965,7 +4116,6 @@
         <w:tc>
           <w:tcPr>
             <w:tcW w:w="5838" w:type="dxa"/>
-            <w:shd w:val="clear" w:color="auto" w:fill="auto"/>
             <w:tcMar>
               <w:top w:w="50" w:type="dxa"/>
               <w:left w:w="100" w:type="dxa"/>
@@ -3995,7 +4145,6 @@
         <w:tc>
           <w:tcPr>
             <w:tcW w:w="2000" w:type="dxa"/>
-            <w:shd w:val="clear" w:color="auto" w:fill="auto"/>
             <w:tcMar>
               <w:top w:w="50" w:type="dxa"/>
               <w:left w:w="100" w:type="dxa"/>
@@ -4023,7 +4172,6 @@
         <w:tc>
           <w:tcPr>
             <w:tcW w:w="1800" w:type="dxa"/>
-            <w:shd w:val="clear" w:color="auto" w:fill="auto"/>
             <w:tcMar>
               <w:top w:w="50" w:type="dxa"/>
               <w:left w:w="100" w:type="dxa"/>
@@ -4051,7 +4199,6 @@
         <w:tc>
           <w:tcPr>
             <w:tcW w:w="5838" w:type="dxa"/>
-            <w:shd w:val="clear" w:color="auto" w:fill="auto"/>
             <w:tcMar>
               <w:top w:w="50" w:type="dxa"/>
               <w:left w:w="100" w:type="dxa"/>
@@ -4203,7 +4350,6 @@
         <w:rPr>
           <w:sz w:val="26"/>
           <w:szCs w:val="26"/>
-          <w:lang w:val="en-US"/>
         </w:rPr>
       </w:pPr>
       <w:r>
@@ -4980,6 +5126,7 @@
                 <w:lang w:val="en-US"/>
               </w:rPr>
             </w:pPr>
+            <w:proofErr w:type="spellStart"/>
             <w:r>
               <w:rPr>
                 <w:b/>
@@ -4989,8 +5136,33 @@
                 <w:szCs w:val="26"/>
                 <w:lang w:val="en-US"/>
               </w:rPr>
-              <w:t>Loại lệnh</w:t>
-            </w:r>
+              <w:t>Loại</w:t>
+            </w:r>
+            <w:proofErr w:type="spellEnd"/>
+            <w:r>
+              <w:rPr>
+                <w:b/>
+                <w:bCs/>
+                <w:color w:val="auto"/>
+                <w:sz w:val="26"/>
+                <w:szCs w:val="26"/>
+                <w:lang w:val="en-US"/>
+              </w:rPr>
+              <w:t xml:space="preserve"> </w:t>
+            </w:r>
+            <w:proofErr w:type="spellStart"/>
+            <w:r>
+              <w:rPr>
+                <w:b/>
+                <w:bCs/>
+                <w:color w:val="auto"/>
+                <w:sz w:val="26"/>
+                <w:szCs w:val="26"/>
+                <w:lang w:val="en-US"/>
+              </w:rPr>
+              <w:t>lệnh</w:t>
+            </w:r>
+            <w:proofErr w:type="spellEnd"/>
           </w:p>
         </w:tc>
         <w:tc>
@@ -5011,6 +5183,7 @@
                 <w:lang w:val="en-US"/>
               </w:rPr>
             </w:pPr>
+            <w:proofErr w:type="spellStart"/>
             <w:r>
               <w:rPr>
                 <w:b/>
@@ -5020,8 +5193,33 @@
                 <w:szCs w:val="26"/>
                 <w:lang w:val="en-US"/>
               </w:rPr>
-              <w:t>Ví dụ</w:t>
-            </w:r>
+              <w:t>Ví</w:t>
+            </w:r>
+            <w:proofErr w:type="spellEnd"/>
+            <w:r>
+              <w:rPr>
+                <w:b/>
+                <w:bCs/>
+                <w:color w:val="auto"/>
+                <w:sz w:val="26"/>
+                <w:szCs w:val="26"/>
+                <w:lang w:val="en-US"/>
+              </w:rPr>
+              <w:t xml:space="preserve"> </w:t>
+            </w:r>
+            <w:proofErr w:type="spellStart"/>
+            <w:r>
+              <w:rPr>
+                <w:b/>
+                <w:bCs/>
+                <w:color w:val="auto"/>
+                <w:sz w:val="26"/>
+                <w:szCs w:val="26"/>
+                <w:lang w:val="en-US"/>
+              </w:rPr>
+              <w:t>dụ</w:t>
+            </w:r>
+            <w:proofErr w:type="spellEnd"/>
           </w:p>
         </w:tc>
         <w:tc>
@@ -5042,6 +5240,7 @@
                 <w:lang w:val="en-US"/>
               </w:rPr>
             </w:pPr>
+            <w:proofErr w:type="spellStart"/>
             <w:r>
               <w:rPr>
                 <w:b/>
@@ -5051,8 +5250,57 @@
                 <w:szCs w:val="26"/>
                 <w:lang w:val="en-US"/>
               </w:rPr>
-              <w:t>Xử lý tại</w:t>
-            </w:r>
+              <w:t>Xử</w:t>
+            </w:r>
+            <w:proofErr w:type="spellEnd"/>
+            <w:r>
+              <w:rPr>
+                <w:b/>
+                <w:bCs/>
+                <w:color w:val="auto"/>
+                <w:sz w:val="26"/>
+                <w:szCs w:val="26"/>
+                <w:lang w:val="en-US"/>
+              </w:rPr>
+              <w:t xml:space="preserve"> </w:t>
+            </w:r>
+            <w:proofErr w:type="spellStart"/>
+            <w:r>
+              <w:rPr>
+                <w:b/>
+                <w:bCs/>
+                <w:color w:val="auto"/>
+                <w:sz w:val="26"/>
+                <w:szCs w:val="26"/>
+                <w:lang w:val="en-US"/>
+              </w:rPr>
+              <w:t>lý</w:t>
+            </w:r>
+            <w:proofErr w:type="spellEnd"/>
+            <w:r>
+              <w:rPr>
+                <w:b/>
+                <w:bCs/>
+                <w:color w:val="auto"/>
+                <w:sz w:val="26"/>
+                <w:szCs w:val="26"/>
+                <w:lang w:val="en-US"/>
+              </w:rPr>
+              <w:t xml:space="preserve"> </w:t>
+            </w:r>
+            <w:proofErr w:type="spellStart"/>
+            <w:r>
+              <w:rPr>
+                <w:b/>
+                <w:bCs/>
+                <w:color w:val="auto"/>
+                <w:sz w:val="26"/>
+                <w:szCs w:val="26"/>
+                <w:lang w:val="en-US"/>
+              </w:rPr>
+              <w:t>tại</w:t>
+            </w:r>
+            <w:proofErr w:type="spellEnd"/>
           </w:p>
         </w:tc>
         <w:tc>
@@ -5073,6 +5321,7 @@
                 <w:lang w:val="en-US"/>
               </w:rPr>
             </w:pPr>
+            <w:proofErr w:type="spellStart"/>
             <w:r>
               <w:rPr>
                 <w:b/>
@@ -5082,8 +5331,33 @@
                 <w:szCs w:val="26"/>
                 <w:lang w:val="en-US"/>
               </w:rPr>
-              <w:t>Đặc điểm</w:t>
-            </w:r>
+              <w:t>Đặc</w:t>
+            </w:r>
+            <w:proofErr w:type="spellEnd"/>
+            <w:r>
+              <w:rPr>
+                <w:b/>
+                <w:bCs/>
+                <w:color w:val="auto"/>
+                <w:sz w:val="26"/>
+                <w:szCs w:val="26"/>
+                <w:lang w:val="en-US"/>
+              </w:rPr>
+              <w:t xml:space="preserve"> </w:t>
+            </w:r>
+            <w:proofErr w:type="spellStart"/>
+            <w:r>
+              <w:rPr>
+                <w:b/>
+                <w:bCs/>
+                <w:color w:val="auto"/>
+                <w:sz w:val="26"/>
+                <w:szCs w:val="26"/>
+                <w:lang w:val="en-US"/>
+              </w:rPr>
+              <w:t>điểm</w:t>
+            </w:r>
+            <w:proofErr w:type="spellEnd"/>
           </w:p>
         </w:tc>
       </w:tr>
@@ -9190,7 +9464,6 @@
         <w:rPr>
           <w:sz w:val="26"/>
           <w:szCs w:val="26"/>
-          <w:lang w:val="en-US"/>
         </w:rPr>
         <w:t>4</w:t>
       </w:r>
@@ -9215,7 +9488,6 @@
       <w:r>
         <w:rPr>
           <w:szCs w:val="26"/>
-          <w:lang w:val="en-US"/>
         </w:rPr>
         <w:t>4</w:t>
       </w:r>
@@ -9414,7 +9686,6 @@
       <w:r>
         <w:rPr>
           <w:szCs w:val="26"/>
-          <w:lang w:val="en-US"/>
         </w:rPr>
         <w:t>4</w:t>
       </w:r>
@@ -9538,7 +9809,6 @@
       <w:r>
         <w:rPr>
           <w:szCs w:val="26"/>
-          <w:lang w:val="en-US"/>
         </w:rPr>
         <w:t>4</w:t>
       </w:r>
@@ -9571,12 +9841,68 @@
       <w:pPr>
         <w:spacing w:before="60" w:after="60" w:line="276" w:lineRule="auto"/>
         <w:rPr>
-          <w:b/>
-          <w:bCs/>
-          <w:sz w:val="26"/>
-          <w:szCs w:val="26"/>
-        </w:rPr>
-      </w:pPr>
+          <w:sz w:val="26"/>
+          <w:szCs w:val="26"/>
+        </w:rPr>
+      </w:pPr>
+    </w:p>
+    <w:p>
+      <w:pPr>
+        <w:spacing w:before="60" w:after="60" w:line="276" w:lineRule="auto"/>
+        <w:rPr>
+          <w:sz w:val="26"/>
+          <w:szCs w:val="26"/>
+        </w:rPr>
+      </w:pPr>
+      <w:r>
+        <w:rPr>
+          <w:sz w:val="26"/>
+          <w:szCs w:val="26"/>
+        </w:rPr>
+        <w:t xml:space="preserve">Link github: </w:t>
+      </w:r>
+      <w:hyperlink r:id="rId11" w:history="1">
+        <w:r>
+          <w:rPr>
+            <w:rStyle w:val="Hyperlink"/>
+            <w:sz w:val="26"/>
+            <w:szCs w:val="26"/>
+          </w:rPr>
+          <w:t>https://github.com/Draken299/UDM5.git</w:t>
+        </w:r>
+      </w:hyperlink>
+    </w:p>
+    <w:p>
+      <w:pPr>
+        <w:spacing w:before="60" w:after="60" w:line="276" w:lineRule="auto"/>
+        <w:rPr>
+          <w:sz w:val="26"/>
+          <w:szCs w:val="26"/>
+        </w:rPr>
+      </w:pPr>
+    </w:p>
+    <w:p>
+      <w:pPr>
+        <w:spacing w:before="60" w:after="60" w:line="276" w:lineRule="auto"/>
+        <w:rPr>
+          <w:sz w:val="26"/>
+          <w:szCs w:val="26"/>
+        </w:rPr>
+      </w:pPr>
+      <w:r>
+        <w:rPr>
+          <w:sz w:val="26"/>
+          <w:szCs w:val="26"/>
+        </w:rPr>
+        <w:t xml:space="preserve">Link video báo cáo: </w:t>
+      </w:r>
+      <w:r>
+        <w:rPr>
+          <w:sz w:val="26"/>
+          <w:szCs w:val="26"/>
+        </w:rPr>
+        <w:t>https://youtu.be/d6ltEwetF2Q?si=LClWDMICbADE1sag</w:t>
+      </w:r>
       <w:r>
         <w:rPr>
           <w:sz w:val="26"/>
@@ -9626,7 +9952,7 @@
         </w:rPr>
         <w:t xml:space="preserve">Oracle Corporation. (2024). Java Tutorials — Concurrency in Swing. </w:t>
       </w:r>
-      <w:hyperlink r:id="rId11" w:history="1">
+      <w:hyperlink r:id="rId12" w:history="1">
         <w:r>
           <w:rPr>
             <w:color w:val="0563C1"/>
@@ -9658,7 +9984,7 @@
         </w:rPr>
         <w:t xml:space="preserve">Oracle Corporation. (2024). Java Tutorials — All About Sockets. </w:t>
       </w:r>
-      <w:hyperlink r:id="rId12" w:history="1">
+      <w:hyperlink r:id="rId13" w:history="1">
         <w:r>
           <w:rPr>
             <w:color w:val="0563C1"/>
@@ -9690,7 +10016,7 @@
         </w:rPr>
         <w:t xml:space="preserve">Baeldung. (2024). Guide to java.lang.Thread. </w:t>
       </w:r>
-      <w:hyperlink r:id="rId13" w:history="1">
+      <w:hyperlink r:id="rId14" w:history="1">
         <w:r>
           <w:rPr>
             <w:color w:val="0563C1"/>
@@ -9722,7 +10048,7 @@
         </w:rPr>
         <w:t xml:space="preserve">Baeldung. (2024). Introduction to Thread Pools in Java. </w:t>
       </w:r>
-      <w:hyperlink r:id="rId14" w:history="1">
+      <w:hyperlink r:id="rId15" w:history="1">
         <w:r>
           <w:rPr>
             <w:color w:val="0563C1"/>
@@ -9754,7 +10080,7 @@
         </w:rPr>
         <w:t xml:space="preserve">Baeldung. (2024). Guide to CompletableFuture. </w:t>
       </w:r>
-      <w:hyperlink r:id="rId15" w:history="1">
+      <w:hyperlink r:id="rId16" w:history="1">
         <w:r>
           <w:rPr>
             <w:color w:val="0563C1"/>
@@ -9786,7 +10112,7 @@
         </w:rPr>
         <w:t xml:space="preserve">GeeksforGeeks. (2024). Socket Programming in Java. </w:t>
       </w:r>
-      <w:hyperlink r:id="rId16" w:history="1">
+      <w:hyperlink r:id="rId17" w:history="1">
         <w:r>
           <w:rPr>
             <w:color w:val="0563C1"/>
@@ -9818,7 +10144,7 @@
         </w:rPr>
         <w:t xml:space="preserve">GeeksforGeeks. (2024). Multithreading in Java. </w:t>
       </w:r>
-      <w:hyperlink r:id="rId17" w:history="1">
+      <w:hyperlink r:id="rId18" w:history="1">
         <w:r>
           <w:rPr>
             <w:color w:val="0563C1"/>
@@ -9850,7 +10176,7 @@
         </w:rPr>
         <w:t xml:space="preserve">OWASP Foundation. (2024). Authentication Cheat Sheet. </w:t>
       </w:r>
-      <w:hyperlink r:id="rId18" w:history="1">
+      <w:hyperlink r:id="rId19" w:history="1">
         <w:r>
           <w:rPr>
             <w:color w:val="0563C1"/>
@@ -9882,7 +10208,7 @@
         </w:rPr>
         <w:t xml:space="preserve">OWASP Foundation. (2024). Transport Layer Security Cheat Sheet. </w:t>
       </w:r>
-      <w:hyperlink r:id="rId19" w:history="1">
+      <w:hyperlink r:id="rId20" w:history="1">
         <w:r>
           <w:rPr>
             <w:color w:val="0563C1"/>
@@ -9904,7 +10230,7 @@
       </w:pPr>
     </w:p>
     <w:sectPr>
-      <w:footerReference w:type="default" r:id="rId20"/>
+      <w:footerReference w:type="default" r:id="rId21"/>
       <w:pgSz w:w="11906" w:h="16838"/>
       <w:pgMar w:top="1021" w:right="1021" w:bottom="1021" w:left="1418" w:header="709" w:footer="709" w:gutter="0"/>
       <w:pgNumType w:start="1"/>
@@ -9916,7 +10242,7 @@
 </file>
 
 <file path=word/endnotes.xml><?xml version="1.0" encoding="utf-8"?>
-<w:endnotes xmlns:wpc="http://schemas.microsoft.com/office/word/2010/wordprocessingCanvas" xmlns:cx="http://schemas.microsoft.com/office/drawing/2014/chartex" xmlns:cx1="http://schemas.microsoft.com/office/drawing/2015/9/8/chartex" xmlns:cx2="http://schemas.microsoft.com/office/drawing/2015/10/21/chartex" xmlns:cx3="http://schemas.microsoft.com/office/drawing/2016/5/9/chartex" xmlns:cx4="http://schemas.microsoft.com/office/drawing/2016/5/10/chartex" xmlns:cx5="http://schemas.microsoft.com/office/drawing/2016/5/11/chartex" xmlns:cx6="http://schemas.microsoft.com/office/drawing/2016/5/12/chartex" xmlns:cx7="http://schemas.microsoft.com/office/drawing/2016/5/13/chartex" xmlns:cx8="http://schemas.microsoft.com/office/drawing/2016/5/14/chartex" xmlns:mc="http://schemas.openxmlformats.org/markup-compatibility/2006" xmlns:aink="http://schemas.microsoft.com/office/drawing/2016/ink" xmlns:am3d="http://schemas.microsoft.com/office/drawing/2017/model3d" xmlns:o="urn:schemas-microsoft-com:office:office" xmlns:r="http://schemas.openxmlformats.org/officeDocument/2006/relationships" xmlns:m="http://schemas.openxmlformats.org/officeDocument/2006/math" xmlns:v="urn:schemas-microsoft-com:vml" xmlns:wp14="http://schemas.microsoft.com/office/word/2010/wordprocessingDrawing" xmlns:wp="http://schemas.openxmlformats.org/drawingml/2006/wordprocessingDrawing" xmlns:w10="urn:schemas-microsoft-com:office:word" xmlns:w="http://schemas.openxmlformats.org/wordprocessingml/2006/main" xmlns:w14="http://schemas.microsoft.com/office/word/2010/wordml" xmlns:w15="http://schemas.microsoft.com/office/word/2012/wordml" xmlns:w16cex="http://schemas.microsoft.com/office/word/2018/wordml/cex" xmlns:w16cid="http://schemas.microsoft.com/office/word/2016/wordml/cid" xmlns:w16="http://schemas.microsoft.com/office/word/2018/wordml" xmlns:w16sdtdh="http://schemas.microsoft.com/office/word/2020/wordml/sdtdatahash" xmlns:w16se="http://schemas.microsoft.com/office/word/2015/wordml/symex" xmlns:wpg="http://schemas.microsoft.com/office/word/2010/wordprocessingGroup" xmlns:wpi="http://schemas.microsoft.com/office/word/2010/wordprocessingInk" xmlns:wne="http://schemas.microsoft.com/office/word/2006/wordml" xmlns:wps="http://schemas.microsoft.com/office/word/2010/wordprocessingShape" mc:Ignorable="w14 w15 w16se w16cid w16 w16cex w16sdtdh wp14">
+<w:endnotes xmlns:wpc="http://schemas.microsoft.com/office/word/2010/wordprocessingCanvas" xmlns:cx="http://schemas.microsoft.com/office/drawing/2014/chartex" xmlns:cx1="http://schemas.microsoft.com/office/drawing/2015/9/8/chartex" xmlns:cx2="http://schemas.microsoft.com/office/drawing/2015/10/21/chartex" xmlns:cx3="http://schemas.microsoft.com/office/drawing/2016/5/9/chartex" xmlns:cx4="http://schemas.microsoft.com/office/drawing/2016/5/10/chartex" xmlns:cx5="http://schemas.microsoft.com/office/drawing/2016/5/11/chartex" xmlns:cx6="http://schemas.microsoft.com/office/drawing/2016/5/12/chartex" xmlns:cx7="http://schemas.microsoft.com/office/drawing/2016/5/13/chartex" xmlns:cx8="http://schemas.microsoft.com/office/drawing/2016/5/14/chartex" xmlns:mc="http://schemas.openxmlformats.org/markup-compatibility/2006" xmlns:aink="http://schemas.microsoft.com/office/drawing/2016/ink" xmlns:am3d="http://schemas.microsoft.com/office/drawing/2017/model3d" xmlns:o="urn:schemas-microsoft-com:office:office" xmlns:oel="http://schemas.microsoft.com/office/2019/extlst" xmlns:r="http://schemas.openxmlformats.org/officeDocument/2006/relationships" xmlns:m="http://schemas.openxmlformats.org/officeDocument/2006/math" xmlns:v="urn:schemas-microsoft-com:vml" xmlns:wp14="http://schemas.microsoft.com/office/word/2010/wordprocessingDrawing" xmlns:wp="http://schemas.openxmlformats.org/drawingml/2006/wordprocessingDrawing" xmlns:w10="urn:schemas-microsoft-com:office:word" xmlns:w="http://schemas.openxmlformats.org/wordprocessingml/2006/main" xmlns:w14="http://schemas.microsoft.com/office/word/2010/wordml" xmlns:w15="http://schemas.microsoft.com/office/word/2012/wordml" xmlns:w16cex="http://schemas.microsoft.com/office/word/2018/wordml/cex" xmlns:w16cid="http://schemas.microsoft.com/office/word/2016/wordml/cid" xmlns:w16="http://schemas.microsoft.com/office/word/2018/wordml" xmlns:w16du="http://schemas.microsoft.com/office/word/2023/wordml/word16du" xmlns:w16sdtdh="http://schemas.microsoft.com/office/word/2020/wordml/sdtdatahash" xmlns:w16sdtfl="http://schemas.microsoft.com/office/word/2024/wordml/sdtformatlock" xmlns:w16se="http://schemas.microsoft.com/office/word/2015/wordml/symex" xmlns:wpg="http://schemas.microsoft.com/office/word/2010/wordprocessingGroup" xmlns:wpi="http://schemas.microsoft.com/office/word/2010/wordprocessingInk" xmlns:wne="http://schemas.microsoft.com/office/word/2006/wordml" xmlns:wps="http://schemas.microsoft.com/office/word/2010/wordprocessingShape" mc:Ignorable="w14 w15 w16se w16cid w16 w16cex w16sdtdh w16sdtfl w16du wp14">
   <w:endnote w:type="separator" w:id="-1">
     <w:p>
       <w:r>
@@ -9935,7 +10261,7 @@
 </file>
 
 <file path=word/footer1.xml><?xml version="1.0" encoding="utf-8"?>
-<w:ftr xmlns:wpc="http://schemas.microsoft.com/office/word/2010/wordprocessingCanvas" xmlns:cx="http://schemas.microsoft.com/office/drawing/2014/chartex" xmlns:cx1="http://schemas.microsoft.com/office/drawing/2015/9/8/chartex" xmlns:cx2="http://schemas.microsoft.com/office/drawing/2015/10/21/chartex" xmlns:cx3="http://schemas.microsoft.com/office/drawing/2016/5/9/chartex" xmlns:cx4="http://schemas.microsoft.com/office/drawing/2016/5/10/chartex" xmlns:cx5="http://schemas.microsoft.com/office/drawing/2016/5/11/chartex" xmlns:cx6="http://schemas.microsoft.com/office/drawing/2016/5/12/chartex" xmlns:cx7="http://schemas.microsoft.com/office/drawing/2016/5/13/chartex" xmlns:cx8="http://schemas.microsoft.com/office/drawing/2016/5/14/chartex" xmlns:mc="http://schemas.openxmlformats.org/markup-compatibility/2006" xmlns:aink="http://schemas.microsoft.com/office/drawing/2016/ink" xmlns:am3d="http://schemas.microsoft.com/office/drawing/2017/model3d" xmlns:o="urn:schemas-microsoft-com:office:office" xmlns:r="http://schemas.openxmlformats.org/officeDocument/2006/relationships" xmlns:m="http://schemas.openxmlformats.org/officeDocument/2006/math" xmlns:v="urn:schemas-microsoft-com:vml" xmlns:wp14="http://schemas.microsoft.com/office/word/2010/wordprocessingDrawing" xmlns:wp="http://schemas.openxmlformats.org/drawingml/2006/wordprocessingDrawing" xmlns:w10="urn:schemas-microsoft-com:office:word" xmlns:w="http://schemas.openxmlformats.org/wordprocessingml/2006/main" xmlns:w14="http://schemas.microsoft.com/office/word/2010/wordml" xmlns:w15="http://schemas.microsoft.com/office/word/2012/wordml" xmlns:w16cex="http://schemas.microsoft.com/office/word/2018/wordml/cex" xmlns:w16cid="http://schemas.microsoft.com/office/word/2016/wordml/cid" xmlns:w16="http://schemas.microsoft.com/office/word/2018/wordml" xmlns:w16sdtdh="http://schemas.microsoft.com/office/word/2020/wordml/sdtdatahash" xmlns:w16se="http://schemas.microsoft.com/office/word/2015/wordml/symex" xmlns:wpg="http://schemas.microsoft.com/office/word/2010/wordprocessingGroup" xmlns:wpi="http://schemas.microsoft.com/office/word/2010/wordprocessingInk" xmlns:wne="http://schemas.microsoft.com/office/word/2006/wordml" xmlns:wps="http://schemas.microsoft.com/office/word/2010/wordprocessingShape" mc:Ignorable="w14 w15 w16se w16cid w16 w16cex w16sdtdh wp14">
+<w:ftr xmlns:wpc="http://schemas.microsoft.com/office/word/2010/wordprocessingCanvas" xmlns:cx="http://schemas.microsoft.com/office/drawing/2014/chartex" xmlns:cx1="http://schemas.microsoft.com/office/drawing/2015/9/8/chartex" xmlns:cx2="http://schemas.microsoft.com/office/drawing/2015/10/21/chartex" xmlns:cx3="http://schemas.microsoft.com/office/drawing/2016/5/9/chartex" xmlns:cx4="http://schemas.microsoft.com/office/drawing/2016/5/10/chartex" xmlns:cx5="http://schemas.microsoft.com/office/drawing/2016/5/11/chartex" xmlns:cx6="http://schemas.microsoft.com/office/drawing/2016/5/12/chartex" xmlns:cx7="http://schemas.microsoft.com/office/drawing/2016/5/13/chartex" xmlns:cx8="http://schemas.microsoft.com/office/drawing/2016/5/14/chartex" xmlns:mc="http://schemas.openxmlformats.org/markup-compatibility/2006" xmlns:aink="http://schemas.microsoft.com/office/drawing/2016/ink" xmlns:am3d="http://schemas.microsoft.com/office/drawing/2017/model3d" xmlns:o="urn:schemas-microsoft-com:office:office" xmlns:oel="http://schemas.microsoft.com/office/2019/extlst" xmlns:r="http://schemas.openxmlformats.org/officeDocument/2006/relationships" xmlns:m="http://schemas.openxmlformats.org/officeDocument/2006/math" xmlns:v="urn:schemas-microsoft-com:vml" xmlns:wp14="http://schemas.microsoft.com/office/word/2010/wordprocessingDrawing" xmlns:wp="http://schemas.openxmlformats.org/drawingml/2006/wordprocessingDrawing" xmlns:w10="urn:schemas-microsoft-com:office:word" xmlns:w="http://schemas.openxmlformats.org/wordprocessingml/2006/main" xmlns:w14="http://schemas.microsoft.com/office/word/2010/wordml" xmlns:w15="http://schemas.microsoft.com/office/word/2012/wordml" xmlns:w16cex="http://schemas.microsoft.com/office/word/2018/wordml/cex" xmlns:w16cid="http://schemas.microsoft.com/office/word/2016/wordml/cid" xmlns:w16="http://schemas.microsoft.com/office/word/2018/wordml" xmlns:w16du="http://schemas.microsoft.com/office/word/2023/wordml/word16du" xmlns:w16sdtdh="http://schemas.microsoft.com/office/word/2020/wordml/sdtdatahash" xmlns:w16sdtfl="http://schemas.microsoft.com/office/word/2024/wordml/sdtformatlock" xmlns:w16se="http://schemas.microsoft.com/office/word/2015/wordml/symex" xmlns:wpg="http://schemas.microsoft.com/office/word/2010/wordprocessingGroup" xmlns:wpi="http://schemas.microsoft.com/office/word/2010/wordprocessingInk" xmlns:wne="http://schemas.microsoft.com/office/word/2006/wordml" xmlns:wps="http://schemas.microsoft.com/office/word/2010/wordprocessingShape" mc:Ignorable="w14 w15 w16se w16cid w16 w16cex w16sdtdh w16sdtfl w16du wp14">
   <w:sdt>
     <w:sdtPr>
       <w:id w:val="-35122972"/>
@@ -9944,7 +10270,6 @@
         <w:docPartUnique/>
       </w:docPartObj>
     </w:sdtPr>
-    <w:sdtEndPr/>
     <w:sdtContent>
       <w:sdt>
         <w:sdtPr>
@@ -9954,7 +10279,6 @@
             <w:docPartUnique/>
           </w:docPartObj>
         </w:sdtPr>
-        <w:sdtEndPr/>
         <w:sdtContent>
           <w:p>
             <w:pPr>
@@ -9980,7 +10304,7 @@
 </file>
 
 <file path=word/footer2.xml><?xml version="1.0" encoding="utf-8"?>
-<w:ftr xmlns:wpc="http://schemas.microsoft.com/office/word/2010/wordprocessingCanvas" xmlns:cx="http://schemas.microsoft.com/office/drawing/2014/chartex" xmlns:cx1="http://schemas.microsoft.com/office/drawing/2015/9/8/chartex" xmlns:cx2="http://schemas.microsoft.com/office/drawing/2015/10/21/chartex" xmlns:cx3="http://schemas.microsoft.com/office/drawing/2016/5/9/chartex" xmlns:cx4="http://schemas.microsoft.com/office/drawing/2016/5/10/chartex" xmlns:cx5="http://schemas.microsoft.com/office/drawing/2016/5/11/chartex" xmlns:cx6="http://schemas.microsoft.com/office/drawing/2016/5/12/chartex" xmlns:cx7="http://schemas.microsoft.com/office/drawing/2016/5/13/chartex" xmlns:cx8="http://schemas.microsoft.com/office/drawing/2016/5/14/chartex" xmlns:mc="http://schemas.openxmlformats.org/markup-compatibility/2006" xmlns:aink="http://schemas.microsoft.com/office/drawing/2016/ink" xmlns:am3d="http://schemas.microsoft.com/office/drawing/2017/model3d" xmlns:o="urn:schemas-microsoft-com:office:office" xmlns:r="http://schemas.openxmlformats.org/officeDocument/2006/relationships" xmlns:m="http://schemas.openxmlformats.org/officeDocument/2006/math" xmlns:v="urn:schemas-microsoft-com:vml" xmlns:wp14="http://schemas.microsoft.com/office/word/2010/wordprocessingDrawing" xmlns:wp="http://schemas.openxmlformats.org/drawingml/2006/wordprocessingDrawing" xmlns:w10="urn:schemas-microsoft-com:office:word" xmlns:w="http://schemas.openxmlformats.org/wordprocessingml/2006/main" xmlns:w14="http://schemas.microsoft.com/office/word/2010/wordml" xmlns:w15="http://schemas.microsoft.com/office/word/2012/wordml" xmlns:w16cex="http://schemas.microsoft.com/office/word/2018/wordml/cex" xmlns:w16cid="http://schemas.microsoft.com/office/word/2016/wordml/cid" xmlns:w16="http://schemas.microsoft.com/office/word/2018/wordml" xmlns:w16sdtdh="http://schemas.microsoft.com/office/word/2020/wordml/sdtdatahash" xmlns:w16se="http://schemas.microsoft.com/office/word/2015/wordml/symex" xmlns:wpg="http://schemas.microsoft.com/office/word/2010/wordprocessingGroup" xmlns:wpi="http://schemas.microsoft.com/office/word/2010/wordprocessingInk" xmlns:wne="http://schemas.microsoft.com/office/word/2006/wordml" xmlns:wps="http://schemas.microsoft.com/office/word/2010/wordprocessingShape" mc:Ignorable="w14 w15 w16se w16cid w16 w16cex w16sdtdh wp14">
+<w:ftr xmlns:wpc="http://schemas.microsoft.com/office/word/2010/wordprocessingCanvas" xmlns:cx="http://schemas.microsoft.com/office/drawing/2014/chartex" xmlns:cx1="http://schemas.microsoft.com/office/drawing/2015/9/8/chartex" xmlns:cx2="http://schemas.microsoft.com/office/drawing/2015/10/21/chartex" xmlns:cx3="http://schemas.microsoft.com/office/drawing/2016/5/9/chartex" xmlns:cx4="http://schemas.microsoft.com/office/drawing/2016/5/10/chartex" xmlns:cx5="http://schemas.microsoft.com/office/drawing/2016/5/11/chartex" xmlns:cx6="http://schemas.microsoft.com/office/drawing/2016/5/12/chartex" xmlns:cx7="http://schemas.microsoft.com/office/drawing/2016/5/13/chartex" xmlns:cx8="http://schemas.microsoft.com/office/drawing/2016/5/14/chartex" xmlns:mc="http://schemas.openxmlformats.org/markup-compatibility/2006" xmlns:aink="http://schemas.microsoft.com/office/drawing/2016/ink" xmlns:am3d="http://schemas.microsoft.com/office/drawing/2017/model3d" xmlns:o="urn:schemas-microsoft-com:office:office" xmlns:oel="http://schemas.microsoft.com/office/2019/extlst" xmlns:r="http://schemas.openxmlformats.org/officeDocument/2006/relationships" xmlns:m="http://schemas.openxmlformats.org/officeDocument/2006/math" xmlns:v="urn:schemas-microsoft-com:vml" xmlns:wp14="http://schemas.microsoft.com/office/word/2010/wordprocessingDrawing" xmlns:wp="http://schemas.openxmlformats.org/drawingml/2006/wordprocessingDrawing" xmlns:w10="urn:schemas-microsoft-com:office:word" xmlns:w="http://schemas.openxmlformats.org/wordprocessingml/2006/main" xmlns:w14="http://schemas.microsoft.com/office/word/2010/wordml" xmlns:w15="http://schemas.microsoft.com/office/word/2012/wordml" xmlns:w16cex="http://schemas.microsoft.com/office/word/2018/wordml/cex" xmlns:w16cid="http://schemas.microsoft.com/office/word/2016/wordml/cid" xmlns:w16="http://schemas.microsoft.com/office/word/2018/wordml" xmlns:w16du="http://schemas.microsoft.com/office/word/2023/wordml/word16du" xmlns:w16sdtdh="http://schemas.microsoft.com/office/word/2020/wordml/sdtdatahash" xmlns:w16sdtfl="http://schemas.microsoft.com/office/word/2024/wordml/sdtformatlock" xmlns:w16se="http://schemas.microsoft.com/office/word/2015/wordml/symex" xmlns:wpg="http://schemas.microsoft.com/office/word/2010/wordprocessingGroup" xmlns:wpi="http://schemas.microsoft.com/office/word/2010/wordprocessingInk" xmlns:wne="http://schemas.microsoft.com/office/word/2006/wordml" xmlns:wps="http://schemas.microsoft.com/office/word/2010/wordprocessingShape" mc:Ignorable="w14 w15 w16se w16cid w16 w16cex w16sdtdh w16sdtfl w16du wp14">
   <w:sdt>
     <w:sdtPr>
       <w:id w:val="1644626222"/>
@@ -9989,7 +10313,6 @@
         <w:docPartUnique/>
       </w:docPartObj>
     </w:sdtPr>
-    <w:sdtEndPr/>
     <w:sdtContent>
       <w:sdt>
         <w:sdtPr>
@@ -9999,7 +10322,6 @@
             <w:docPartUnique/>
           </w:docPartObj>
         </w:sdtPr>
-        <w:sdtEndPr/>
         <w:sdtContent>
           <w:p>
             <w:pPr>
@@ -10055,7 +10377,7 @@
 </file>
 
 <file path=word/footnotes.xml><?xml version="1.0" encoding="utf-8"?>
-<w:footnotes xmlns:wpc="http://schemas.microsoft.com/office/word/2010/wordprocessingCanvas" xmlns:cx="http://schemas.microsoft.com/office/drawing/2014/chartex" xmlns:cx1="http://schemas.microsoft.com/office/drawing/2015/9/8/chartex" xmlns:cx2="http://schemas.microsoft.com/office/drawing/2015/10/21/chartex" xmlns:cx3="http://schemas.microsoft.com/office/drawing/2016/5/9/chartex" xmlns:cx4="http://schemas.microsoft.com/office/drawing/2016/5/10/chartex" xmlns:cx5="http://schemas.microsoft.com/office/drawing/2016/5/11/chartex" xmlns:cx6="http://schemas.microsoft.com/office/drawing/2016/5/12/chartex" xmlns:cx7="http://schemas.microsoft.com/office/drawing/2016/5/13/chartex" xmlns:cx8="http://schemas.microsoft.com/office/drawing/2016/5/14/chartex" xmlns:mc="http://schemas.openxmlformats.org/markup-compatibility/2006" xmlns:aink="http://schemas.microsoft.com/office/drawing/2016/ink" xmlns:am3d="http://schemas.microsoft.com/office/drawing/2017/model3d" xmlns:o="urn:schemas-microsoft-com:office:office" xmlns:r="http://schemas.openxmlformats.org/officeDocument/2006/relationships" xmlns:m="http://schemas.openxmlformats.org/officeDocument/2006/math" xmlns:v="urn:schemas-microsoft-com:vml" xmlns:wp14="http://schemas.microsoft.com/office/word/2010/wordprocessingDrawing" xmlns:wp="http://schemas.openxmlformats.org/drawingml/2006/wordprocessingDrawing" xmlns:w10="urn:schemas-microsoft-com:office:word" xmlns:w="http://schemas.openxmlformats.org/wordprocessingml/2006/main" xmlns:w14="http://schemas.microsoft.com/office/word/2010/wordml" xmlns:w15="http://schemas.microsoft.com/office/word/2012/wordml" xmlns:w16cex="http://schemas.microsoft.com/office/word/2018/wordml/cex" xmlns:w16cid="http://schemas.microsoft.com/office/word/2016/wordml/cid" xmlns:w16="http://schemas.microsoft.com/office/word/2018/wordml" xmlns:w16sdtdh="http://schemas.microsoft.com/office/word/2020/wordml/sdtdatahash" xmlns:w16se="http://schemas.microsoft.com/office/word/2015/wordml/symex" xmlns:wpg="http://schemas.microsoft.com/office/word/2010/wordprocessingGroup" xmlns:wpi="http://schemas.microsoft.com/office/word/2010/wordprocessingInk" xmlns:wne="http://schemas.microsoft.com/office/word/2006/wordml" xmlns:wps="http://schemas.microsoft.com/office/word/2010/wordprocessingShape" mc:Ignorable="w14 w15 w16se w16cid w16 w16cex w16sdtdh wp14">
+<w:footnotes xmlns:wpc="http://schemas.microsoft.com/office/word/2010/wordprocessingCanvas" xmlns:cx="http://schemas.microsoft.com/office/drawing/2014/chartex" xmlns:cx1="http://schemas.microsoft.com/office/drawing/2015/9/8/chartex" xmlns:cx2="http://schemas.microsoft.com/office/drawing/2015/10/21/chartex" xmlns:cx3="http://schemas.microsoft.com/office/drawing/2016/5/9/chartex" xmlns:cx4="http://schemas.microsoft.com/office/drawing/2016/5/10/chartex" xmlns:cx5="http://schemas.microsoft.com/office/drawing/2016/5/11/chartex" xmlns:cx6="http://schemas.microsoft.com/office/drawing/2016/5/12/chartex" xmlns:cx7="http://schemas.microsoft.com/office/drawing/2016/5/13/chartex" xmlns:cx8="http://schemas.microsoft.com/office/drawing/2016/5/14/chartex" xmlns:mc="http://schemas.openxmlformats.org/markup-compatibility/2006" xmlns:aink="http://schemas.microsoft.com/office/drawing/2016/ink" xmlns:am3d="http://schemas.microsoft.com/office/drawing/2017/model3d" xmlns:o="urn:schemas-microsoft-com:office:office" xmlns:oel="http://schemas.microsoft.com/office/2019/extlst" xmlns:r="http://schemas.openxmlformats.org/officeDocument/2006/relationships" xmlns:m="http://schemas.openxmlformats.org/officeDocument/2006/math" xmlns:v="urn:schemas-microsoft-com:vml" xmlns:wp14="http://schemas.microsoft.com/office/word/2010/wordprocessingDrawing" xmlns:wp="http://schemas.openxmlformats.org/drawingml/2006/wordprocessingDrawing" xmlns:w10="urn:schemas-microsoft-com:office:word" xmlns:w="http://schemas.openxmlformats.org/wordprocessingml/2006/main" xmlns:w14="http://schemas.microsoft.com/office/word/2010/wordml" xmlns:w15="http://schemas.microsoft.com/office/word/2012/wordml" xmlns:w16cex="http://schemas.microsoft.com/office/word/2018/wordml/cex" xmlns:w16cid="http://schemas.microsoft.com/office/word/2016/wordml/cid" xmlns:w16="http://schemas.microsoft.com/office/word/2018/wordml" xmlns:w16du="http://schemas.microsoft.com/office/word/2023/wordml/word16du" xmlns:w16sdtdh="http://schemas.microsoft.com/office/word/2020/wordml/sdtdatahash" xmlns:w16sdtfl="http://schemas.microsoft.com/office/word/2024/wordml/sdtformatlock" xmlns:w16se="http://schemas.microsoft.com/office/word/2015/wordml/symex" xmlns:wpg="http://schemas.microsoft.com/office/word/2010/wordprocessingGroup" xmlns:wpi="http://schemas.microsoft.com/office/word/2010/wordprocessingInk" xmlns:wne="http://schemas.microsoft.com/office/word/2006/wordml" xmlns:wps="http://schemas.microsoft.com/office/word/2010/wordprocessingShape" mc:Ignorable="w14 w15 w16se w16cid w16 w16cex w16sdtdh w16sdtfl w16du wp14">
   <w:footnote w:type="separator" w:id="-1">
     <w:p>
       <w:r>
@@ -10074,7 +10396,7 @@
 </file>
 
 <file path=word/header1.xml><?xml version="1.0" encoding="utf-8"?>
-<w:hdr xmlns:wpc="http://schemas.microsoft.com/office/word/2010/wordprocessingCanvas" xmlns:cx="http://schemas.microsoft.com/office/drawing/2014/chartex" xmlns:cx1="http://schemas.microsoft.com/office/drawing/2015/9/8/chartex" xmlns:cx2="http://schemas.microsoft.com/office/drawing/2015/10/21/chartex" xmlns:cx3="http://schemas.microsoft.com/office/drawing/2016/5/9/chartex" xmlns:cx4="http://schemas.microsoft.com/office/drawing/2016/5/10/chartex" xmlns:cx5="http://schemas.microsoft.com/office/drawing/2016/5/11/chartex" xmlns:cx6="http://schemas.microsoft.com/office/drawing/2016/5/12/chartex" xmlns:cx7="http://schemas.microsoft.com/office/drawing/2016/5/13/chartex" xmlns:cx8="http://schemas.microsoft.com/office/drawing/2016/5/14/chartex" xmlns:mc="http://schemas.openxmlformats.org/markup-compatibility/2006" xmlns:aink="http://schemas.microsoft.com/office/drawing/2016/ink" xmlns:am3d="http://schemas.microsoft.com/office/drawing/2017/model3d" xmlns:o="urn:schemas-microsoft-com:office:office" xmlns:r="http://schemas.openxmlformats.org/officeDocument/2006/relationships" xmlns:m="http://schemas.openxmlformats.org/officeDocument/2006/math" xmlns:v="urn:schemas-microsoft-com:vml" xmlns:wp14="http://schemas.microsoft.com/office/word/2010/wordprocessingDrawing" xmlns:wp="http://schemas.openxmlformats.org/drawingml/2006/wordprocessingDrawing" xmlns:w10="urn:schemas-microsoft-com:office:word" xmlns:w="http://schemas.openxmlformats.org/wordprocessingml/2006/main" xmlns:w14="http://schemas.microsoft.com/office/word/2010/wordml" xmlns:w15="http://schemas.microsoft.com/office/word/2012/wordml" xmlns:w16cex="http://schemas.microsoft.com/office/word/2018/wordml/cex" xmlns:w16cid="http://schemas.microsoft.com/office/word/2016/wordml/cid" xmlns:w16="http://schemas.microsoft.com/office/word/2018/wordml" xmlns:w16sdtdh="http://schemas.microsoft.com/office/word/2020/wordml/sdtdatahash" xmlns:w16se="http://schemas.microsoft.com/office/word/2015/wordml/symex" xmlns:wpg="http://schemas.microsoft.com/office/word/2010/wordprocessingGroup" xmlns:wpi="http://schemas.microsoft.com/office/word/2010/wordprocessingInk" xmlns:wne="http://schemas.microsoft.com/office/word/2006/wordml" xmlns:wps="http://schemas.microsoft.com/office/word/2010/wordprocessingShape" mc:Ignorable="w14 w15 w16se w16cid w16 w16cex w16sdtdh wp14">
+<w:hdr xmlns:wpc="http://schemas.microsoft.com/office/word/2010/wordprocessingCanvas" xmlns:cx="http://schemas.microsoft.com/office/drawing/2014/chartex" xmlns:cx1="http://schemas.microsoft.com/office/drawing/2015/9/8/chartex" xmlns:cx2="http://schemas.microsoft.com/office/drawing/2015/10/21/chartex" xmlns:cx3="http://schemas.microsoft.com/office/drawing/2016/5/9/chartex" xmlns:cx4="http://schemas.microsoft.com/office/drawing/2016/5/10/chartex" xmlns:cx5="http://schemas.microsoft.com/office/drawing/2016/5/11/chartex" xmlns:cx6="http://schemas.microsoft.com/office/drawing/2016/5/12/chartex" xmlns:cx7="http://schemas.microsoft.com/office/drawing/2016/5/13/chartex" xmlns:cx8="http://schemas.microsoft.com/office/drawing/2016/5/14/chartex" xmlns:mc="http://schemas.openxmlformats.org/markup-compatibility/2006" xmlns:aink="http://schemas.microsoft.com/office/drawing/2016/ink" xmlns:am3d="http://schemas.microsoft.com/office/drawing/2017/model3d" xmlns:o="urn:schemas-microsoft-com:office:office" xmlns:oel="http://schemas.microsoft.com/office/2019/extlst" xmlns:r="http://schemas.openxmlformats.org/officeDocument/2006/relationships" xmlns:m="http://schemas.openxmlformats.org/officeDocument/2006/math" xmlns:v="urn:schemas-microsoft-com:vml" xmlns:wp14="http://schemas.microsoft.com/office/word/2010/wordprocessingDrawing" xmlns:wp="http://schemas.openxmlformats.org/drawingml/2006/wordprocessingDrawing" xmlns:w10="urn:schemas-microsoft-com:office:word" xmlns:w="http://schemas.openxmlformats.org/wordprocessingml/2006/main" xmlns:w14="http://schemas.microsoft.com/office/word/2010/wordml" xmlns:w15="http://schemas.microsoft.com/office/word/2012/wordml" xmlns:w16cex="http://schemas.microsoft.com/office/word/2018/wordml/cex" xmlns:w16cid="http://schemas.microsoft.com/office/word/2016/wordml/cid" xmlns:w16="http://schemas.microsoft.com/office/word/2018/wordml" xmlns:w16du="http://schemas.microsoft.com/office/word/2023/wordml/word16du" xmlns:w16sdtdh="http://schemas.microsoft.com/office/word/2020/wordml/sdtdatahash" xmlns:w16sdtfl="http://schemas.microsoft.com/office/word/2024/wordml/sdtformatlock" xmlns:w16se="http://schemas.microsoft.com/office/word/2015/wordml/symex" xmlns:wpg="http://schemas.microsoft.com/office/word/2010/wordprocessingGroup" xmlns:wpi="http://schemas.microsoft.com/office/word/2010/wordprocessingInk" xmlns:wne="http://schemas.microsoft.com/office/word/2006/wordml" xmlns:wps="http://schemas.microsoft.com/office/word/2010/wordprocessingShape" mc:Ignorable="w14 w15 w16se w16cid w16 w16cex w16sdtdh w16sdtfl w16du wp14">
   <w:p>
     <w:pPr>
       <w:pStyle w:val="Header"/>
@@ -10084,7 +10406,7 @@
 </file>
 
 <file path=word/numbering.xml><?xml version="1.0" encoding="utf-8"?>
-<w:numbering xmlns:wpc="http://schemas.microsoft.com/office/word/2010/wordprocessingCanvas" xmlns:cx="http://schemas.microsoft.com/office/drawing/2014/chartex" xmlns:cx1="http://schemas.microsoft.com/office/drawing/2015/9/8/chartex" xmlns:cx2="http://schemas.microsoft.com/office/drawing/2015/10/21/chartex" xmlns:cx3="http://schemas.microsoft.com/office/drawing/2016/5/9/chartex" xmlns:cx4="http://schemas.microsoft.com/office/drawing/2016/5/10/chartex" xmlns:cx5="http://schemas.microsoft.com/office/drawing/2016/5/11/chartex" xmlns:cx6="http://schemas.microsoft.com/office/drawing/2016/5/12/chartex" xmlns:cx7="http://schemas.microsoft.com/office/drawing/2016/5/13/chartex" xmlns:cx8="http://schemas.microsoft.com/office/drawing/2016/5/14/chartex" xmlns:mc="http://schemas.openxmlformats.org/markup-compatibility/2006" xmlns:aink="http://schemas.microsoft.com/office/drawing/2016/ink" xmlns:am3d="http://schemas.microsoft.com/office/drawing/2017/model3d" xmlns:o="urn:schemas-microsoft-com:office:office" xmlns:r="http://schemas.openxmlformats.org/officeDocument/2006/relationships" xmlns:m="http://schemas.openxmlformats.org/officeDocument/2006/math" xmlns:v="urn:schemas-microsoft-com:vml" xmlns:wp14="http://schemas.microsoft.com/office/word/2010/wordprocessingDrawing" xmlns:wp="http://schemas.openxmlformats.org/drawingml/2006/wordprocessingDrawing" xmlns:w10="urn:schemas-microsoft-com:office:word" xmlns:w="http://schemas.openxmlformats.org/wordprocessingml/2006/main" xmlns:w14="http://schemas.microsoft.com/office/word/2010/wordml" xmlns:w15="http://schemas.microsoft.com/office/word/2012/wordml" xmlns:w16cex="http://schemas.microsoft.com/office/word/2018/wordml/cex" xmlns:w16cid="http://schemas.microsoft.com/office/word/2016/wordml/cid" xmlns:w16="http://schemas.microsoft.com/office/word/2018/wordml" xmlns:w16sdtdh="http://schemas.microsoft.com/office/word/2020/wordml/sdtdatahash" xmlns:w16se="http://schemas.microsoft.com/office/word/2015/wordml/symex" xmlns:wpg="http://schemas.microsoft.com/office/word/2010/wordprocessingGroup" xmlns:wpi="http://schemas.microsoft.com/office/word/2010/wordprocessingInk" xmlns:wne="http://schemas.microsoft.com/office/word/2006/wordml" xmlns:wps="http://schemas.microsoft.com/office/word/2010/wordprocessingShape" mc:Ignorable="w14 w15 w16se w16cid w16 w16cex w16sdtdh wp14">
+<w:numbering xmlns:wpc="http://schemas.microsoft.com/office/word/2010/wordprocessingCanvas" xmlns:cx="http://schemas.microsoft.com/office/drawing/2014/chartex" xmlns:cx1="http://schemas.microsoft.com/office/drawing/2015/9/8/chartex" xmlns:cx2="http://schemas.microsoft.com/office/drawing/2015/10/21/chartex" xmlns:cx3="http://schemas.microsoft.com/office/drawing/2016/5/9/chartex" xmlns:cx4="http://schemas.microsoft.com/office/drawing/2016/5/10/chartex" xmlns:cx5="http://schemas.microsoft.com/office/drawing/2016/5/11/chartex" xmlns:cx6="http://schemas.microsoft.com/office/drawing/2016/5/12/chartex" xmlns:cx7="http://schemas.microsoft.com/office/drawing/2016/5/13/chartex" xmlns:cx8="http://schemas.microsoft.com/office/drawing/2016/5/14/chartex" xmlns:mc="http://schemas.openxmlformats.org/markup-compatibility/2006" xmlns:aink="http://schemas.microsoft.com/office/drawing/2016/ink" xmlns:am3d="http://schemas.microsoft.com/office/drawing/2017/model3d" xmlns:o="urn:schemas-microsoft-com:office:office" xmlns:oel="http://schemas.microsoft.com/office/2019/extlst" xmlns:r="http://schemas.openxmlformats.org/officeDocument/2006/relationships" xmlns:m="http://schemas.openxmlformats.org/officeDocument/2006/math" xmlns:v="urn:schemas-microsoft-com:vml" xmlns:wp14="http://schemas.microsoft.com/office/word/2010/wordprocessingDrawing" xmlns:wp="http://schemas.openxmlformats.org/drawingml/2006/wordprocessingDrawing" xmlns:w10="urn:schemas-microsoft-com:office:word" xmlns:w="http://schemas.openxmlformats.org/wordprocessingml/2006/main" xmlns:w14="http://schemas.microsoft.com/office/word/2010/wordml" xmlns:w15="http://schemas.microsoft.com/office/word/2012/wordml" xmlns:w16cex="http://schemas.microsoft.com/office/word/2018/wordml/cex" xmlns:w16cid="http://schemas.microsoft.com/office/word/2016/wordml/cid" xmlns:w16="http://schemas.microsoft.com/office/word/2018/wordml" xmlns:w16du="http://schemas.microsoft.com/office/word/2023/wordml/word16du" xmlns:w16sdtdh="http://schemas.microsoft.com/office/word/2020/wordml/sdtdatahash" xmlns:w16sdtfl="http://schemas.microsoft.com/office/word/2024/wordml/sdtformatlock" xmlns:w16se="http://schemas.microsoft.com/office/word/2015/wordml/symex" xmlns:wpg="http://schemas.microsoft.com/office/word/2010/wordprocessingGroup" xmlns:wpi="http://schemas.microsoft.com/office/word/2010/wordprocessingInk" xmlns:wne="http://schemas.microsoft.com/office/word/2006/wordml" xmlns:wps="http://schemas.microsoft.com/office/word/2010/wordprocessingShape" mc:Ignorable="w14 w15 w16se w16cid w16 w16cex w16sdtdh w16sdtfl w16du wp14">
   <w:abstractNum w:abstractNumId="0" w15:restartNumberingAfterBreak="0">
     <w:nsid w:val="11C15DD2"/>
     <w:multiLevelType w:val="hybridMultilevel"/>
@@ -10357,32 +10679,32 @@
       <w:lvlJc w:val="left"/>
     </w:lvl>
   </w:abstractNum>
-  <w:num w:numId="1">
+  <w:num w:numId="1" w16cid:durableId="1307511431">
     <w:abstractNumId w:val="0"/>
     <w:lvlOverride w:ilvl="0">
       <w:startOverride w:val="1"/>
     </w:lvlOverride>
   </w:num>
-  <w:num w:numId="2">
+  <w:num w:numId="2" w16cid:durableId="1722439978">
     <w:abstractNumId w:val="3"/>
     <w:lvlOverride w:ilvl="0">
       <w:startOverride w:val="1"/>
     </w:lvlOverride>
   </w:num>
-  <w:num w:numId="3">
+  <w:num w:numId="3" w16cid:durableId="780149933">
     <w:abstractNumId w:val="1"/>
     <w:lvlOverride w:ilvl="0">
       <w:startOverride w:val="1"/>
     </w:lvlOverride>
   </w:num>
-  <w:num w:numId="4">
+  <w:num w:numId="4" w16cid:durableId="140510668">
     <w:abstractNumId w:val="2"/>
   </w:num>
 </w:numbering>
 </file>
 
 <file path=word/styles.xml><?xml version="1.0" encoding="utf-8"?>
-<w:styles xmlns:mc="http://schemas.openxmlformats.org/markup-compatibility/2006" xmlns:r="http://schemas.openxmlformats.org/officeDocument/2006/relationships" xmlns:w="http://schemas.openxmlformats.org/wordprocessingml/2006/main" xmlns:w14="http://schemas.microsoft.com/office/word/2010/wordml" xmlns:w15="http://schemas.microsoft.com/office/word/2012/wordml" xmlns:w16cex="http://schemas.microsoft.com/office/word/2018/wordml/cex" xmlns:w16cid="http://schemas.microsoft.com/office/word/2016/wordml/cid" xmlns:w16="http://schemas.microsoft.com/office/word/2018/wordml" xmlns:w16sdtdh="http://schemas.microsoft.com/office/word/2020/wordml/sdtdatahash" xmlns:w16se="http://schemas.microsoft.com/office/word/2015/wordml/symex" mc:Ignorable="w14 w15 w16se w16cid w16 w16cex w16sdtdh">
+<w:styles xmlns:mc="http://schemas.openxmlformats.org/markup-compatibility/2006" xmlns:r="http://schemas.openxmlformats.org/officeDocument/2006/relationships" xmlns:w="http://schemas.openxmlformats.org/wordprocessingml/2006/main" xmlns:w14="http://schemas.microsoft.com/office/word/2010/wordml" xmlns:w15="http://schemas.microsoft.com/office/word/2012/wordml" xmlns:w16cex="http://schemas.microsoft.com/office/word/2018/wordml/cex" xmlns:w16cid="http://schemas.microsoft.com/office/word/2016/wordml/cid" xmlns:w16="http://schemas.microsoft.com/office/word/2018/wordml" xmlns:w16du="http://schemas.microsoft.com/office/word/2023/wordml/word16du" xmlns:w16sdtdh="http://schemas.microsoft.com/office/word/2020/wordml/sdtdatahash" xmlns:w16sdtfl="http://schemas.microsoft.com/office/word/2024/wordml/sdtformatlock" xmlns:w16se="http://schemas.microsoft.com/office/word/2015/wordml/symex" mc:Ignorable="w14 w15 w16se w16cid w16 w16cex w16sdtdh w16sdtfl w16du">
   <w:docDefaults>
     <w:rPrDefault>
       <w:rPr>
@@ -11119,6 +11441,18 @@
     <w:uiPriority w:val="99"/>
     <w:rsid w:val="002F3D08"/>
   </w:style>
+  <w:style w:type="character" w:styleId="UnresolvedMention">
+    <w:name w:val="Unresolved Mention"/>
+    <w:basedOn w:val="DefaultParagraphFont"/>
+    <w:uiPriority w:val="99"/>
+    <w:semiHidden/>
+    <w:unhideWhenUsed/>
+    <w:rsid w:val="005F3B3B"/>
+    <w:rPr>
+      <w:color w:val="605E5C"/>
+      <w:shd w:val="clear" w:color="auto" w:fill="E1DFDD"/>
+    </w:rPr>
+  </w:style>
 </w:styles>
 </file>
 

</xml_diff>